<commit_message>
generated reports md -> docx
</commit_message>
<xml_diff>
--- a/lab-01/Отчет.docx
+++ b/lab-01/Отчет.docx
@@ -498,35 +498,6 @@
     </w:p>
     <w:p>
       <w:pPr>
-        <w:pStyle w:val="FirstParagraph"/>
-      </w:pPr>
-      <w:r>
-        <w:t xml:space="preserve">Для загрузки данных использована функция</w:t>
-      </w:r>
-      <w:r>
-        <w:t xml:space="preserve"> </w:t>
-      </w:r>
-      <w:r>
-        <w:rPr>
-          <w:rStyle w:val="VerbatimChar"/>
-        </w:rPr>
-        <w:t xml:space="preserve">pd.read_csv()</w:t>
-      </w:r>
-      <w:r>
-        <w:t xml:space="preserve"> </w:t>
-      </w:r>
-      <w:r>
-        <w:t xml:space="preserve">библиотеки</w:t>
-      </w:r>
-      <w:r>
-        <w:t xml:space="preserve"> </w:t>
-      </w:r>
-      <w:r>
-        <w:t xml:space="preserve">Pandas с указанием разделителя запятой.</w:t>
-      </w:r>
-    </w:p>
-    <w:p>
-      <w:pPr>
         <w:pStyle w:val="SourceCode"/>
       </w:pPr>
       <w:r>
@@ -616,6 +587,36 @@
         </w:rPr>
         <w:t xml:space="preserve">(df.head())</w:t>
       </w:r>
+      <w:r>
+        <w:br/>
+      </w:r>
+      <w:r>
+        <w:rPr>
+          <w:rStyle w:val="BuiltInTok"/>
+        </w:rPr>
+        <w:t xml:space="preserve">print</w:t>
+      </w:r>
+      <w:r>
+        <w:rPr>
+          <w:rStyle w:val="NormalTok"/>
+        </w:rPr>
+        <w:t xml:space="preserve">(df.columns.tolist())</w:t>
+      </w:r>
+      <w:r>
+        <w:br/>
+      </w:r>
+      <w:r>
+        <w:rPr>
+          <w:rStyle w:val="BuiltInTok"/>
+        </w:rPr>
+        <w:t xml:space="preserve">print</w:t>
+      </w:r>
+      <w:r>
+        <w:rPr>
+          <w:rStyle w:val="NormalTok"/>
+        </w:rPr>
+        <w:t xml:space="preserve">(df.tail())</w:t>
+      </w:r>
     </w:p>
     <w:p>
       <w:pPr>
@@ -884,6 +885,93 @@
           <w:rStyle w:val="VerbatimChar"/>
         </w:rPr>
         <w:t xml:space="preserve">4    1           Private  338409  Bachelors             13  ...  &lt;=50K</w:t>
+      </w:r>
+      <w:r>
+        <w:br/>
+      </w:r>
+      <w:r>
+        <w:br/>
+      </w:r>
+      <w:r>
+        <w:rPr>
+          <w:rStyle w:val="VerbatimChar"/>
+        </w:rPr>
+        <w:t xml:space="preserve">['age', 'workclass', 'fnlwgt', 'education', 'education-num', 'marital-status',</w:t>
+      </w:r>
+      <w:r>
+        <w:br/>
+      </w:r>
+      <w:r>
+        <w:rPr>
+          <w:rStyle w:val="VerbatimChar"/>
+        </w:rPr>
+        <w:t xml:space="preserve"> 'occupation', 'relationship', 'race', 'sex', 'capitalgain', 'capitalloss',</w:t>
+      </w:r>
+      <w:r>
+        <w:br/>
+      </w:r>
+      <w:r>
+        <w:rPr>
+          <w:rStyle w:val="VerbatimChar"/>
+        </w:rPr>
+        <w:t xml:space="preserve"> 'hoursperweek', 'native-country', 'class']</w:t>
+      </w:r>
+      <w:r>
+        <w:br/>
+      </w:r>
+      <w:r>
+        <w:br/>
+      </w:r>
+      <w:r>
+        <w:rPr>
+          <w:rStyle w:val="VerbatimChar"/>
+        </w:rPr>
+        <w:t xml:space="preserve">       age  workclass   fnlwgt  education  ...  native-country  class</w:t>
+      </w:r>
+      <w:r>
+        <w:br/>
+      </w:r>
+      <w:r>
+        <w:rPr>
+          <w:rStyle w:val="VerbatimChar"/>
+        </w:rPr>
+        <w:t xml:space="preserve">48837    2    Private   215419  Bachelors  ...   United-States  &lt;=50K</w:t>
+      </w:r>
+      <w:r>
+        <w:br/>
+      </w:r>
+      <w:r>
+        <w:rPr>
+          <w:rStyle w:val="VerbatimChar"/>
+        </w:rPr>
+        <w:t xml:space="preserve">48838    4          ?   321403    HS-grad  ...   United-States  &lt;=50K</w:t>
+      </w:r>
+      <w:r>
+        <w:br/>
+      </w:r>
+      <w:r>
+        <w:rPr>
+          <w:rStyle w:val="VerbatimChar"/>
+        </w:rPr>
+        <w:t xml:space="preserve">48839    2    Private   374983  Bachelors  ...   United-States  &lt;=50K</w:t>
+      </w:r>
+      <w:r>
+        <w:br/>
+      </w:r>
+      <w:r>
+        <w:rPr>
+          <w:rStyle w:val="VerbatimChar"/>
+        </w:rPr>
+        <w:t xml:space="preserve">48840    2    Private    83891  Bachelors  ...   United-States  &lt;=50K</w:t>
+      </w:r>
+      <w:r>
+        <w:br/>
+      </w:r>
+      <w:r>
+        <w:rPr>
+          <w:rStyle w:val="VerbatimChar"/>
+        </w:rPr>
+        <w:t xml:space="preserve">48841    1   Self-emp   182148  Bachelors  ...   United-States   &gt;50K</w:t>
       </w:r>
     </w:p>
     <w:p>
@@ -920,13 +1008,13 @@
         <w:t xml:space="preserve">15 столбцов</w:t>
       </w:r>
       <w:r>
-        <w:t xml:space="preserve">.</w:t>
-      </w:r>
-      <w:r>
-        <w:t xml:space="preserve"> </w:t>
-      </w:r>
-      <w:r>
-        <w:t xml:space="preserve">Типы данных: числовые (</w:t>
+        <w:t xml:space="preserve">. Типы данных:</w:t>
+      </w:r>
+      <w:r>
+        <w:t xml:space="preserve"> </w:t>
+      </w:r>
+      <w:r>
+        <w:t xml:space="preserve">числовые (</w:t>
       </w:r>
       <w:r>
         <w:rPr>
@@ -1016,7 +1104,43 @@
         <w:t xml:space="preserve">str</w:t>
       </w:r>
       <w:r>
-        <w:t xml:space="preserve">) —</w:t>
+        <w:t xml:space="preserve">) — остальные 9.</w:t>
+      </w:r>
+      <w:r>
+        <w:t xml:space="preserve"> </w:t>
+      </w:r>
+      <w:r>
+        <w:t xml:space="preserve">Все столбцы ненулевые, однако в</w:t>
+      </w:r>
+      <w:r>
+        <w:t xml:space="preserve"> </w:t>
+      </w:r>
+      <w:r>
+        <w:rPr>
+          <w:rStyle w:val="VerbatimChar"/>
+        </w:rPr>
+        <w:t xml:space="preserve">tail()</w:t>
+      </w:r>
+      <w:r>
+        <w:t xml:space="preserve"> </w:t>
+      </w:r>
+      <w:r>
+        <w:t xml:space="preserve">виден символ</w:t>
+      </w:r>
+      <w:r>
+        <w:t xml:space="preserve"> </w:t>
+      </w:r>
+      <w:r>
+        <w:rPr>
+          <w:rStyle w:val="VerbatimChar"/>
+        </w:rPr>
+        <w:t xml:space="preserve">?</w:t>
+      </w:r>
+      <w:r>
+        <w:t xml:space="preserve"> </w:t>
+      </w:r>
+      <w:r>
+        <w:t xml:space="preserve">в столбце</w:t>
       </w:r>
       <w:r>
         <w:t xml:space="preserve"> </w:t>
@@ -1028,91 +1152,16 @@
         <w:t xml:space="preserve">workclass</w:t>
       </w:r>
       <w:r>
-        <w:t xml:space="preserve">,</w:t>
-      </w:r>
-      <w:r>
-        <w:t xml:space="preserve"> </w:t>
-      </w:r>
-      <w:r>
-        <w:rPr>
-          <w:rStyle w:val="VerbatimChar"/>
-        </w:rPr>
-        <w:t xml:space="preserve">education</w:t>
-      </w:r>
-      <w:r>
-        <w:t xml:space="preserve">,</w:t>
-      </w:r>
-      <w:r>
-        <w:t xml:space="preserve"> </w:t>
-      </w:r>
-      <w:r>
-        <w:rPr>
-          <w:rStyle w:val="VerbatimChar"/>
-        </w:rPr>
-        <w:t xml:space="preserve">marital-status</w:t>
-      </w:r>
-      <w:r>
-        <w:t xml:space="preserve">,</w:t>
-      </w:r>
-      <w:r>
-        <w:t xml:space="preserve"> </w:t>
-      </w:r>
-      <w:r>
-        <w:rPr>
-          <w:rStyle w:val="VerbatimChar"/>
-        </w:rPr>
-        <w:t xml:space="preserve">occupation</w:t>
-      </w:r>
-      <w:r>
-        <w:t xml:space="preserve">,</w:t>
-      </w:r>
-      <w:r>
-        <w:t xml:space="preserve"> </w:t>
-      </w:r>
-      <w:r>
-        <w:rPr>
-          <w:rStyle w:val="VerbatimChar"/>
-        </w:rPr>
-        <w:t xml:space="preserve">relationship</w:t>
-      </w:r>
-      <w:r>
-        <w:t xml:space="preserve">,</w:t>
-      </w:r>
-      <w:r>
-        <w:t xml:space="preserve"> </w:t>
-      </w:r>
-      <w:r>
-        <w:rPr>
-          <w:rStyle w:val="VerbatimChar"/>
-        </w:rPr>
-        <w:t xml:space="preserve">race</w:t>
-      </w:r>
-      <w:r>
-        <w:t xml:space="preserve">,</w:t>
-      </w:r>
-      <w:r>
-        <w:t xml:space="preserve"> </w:t>
-      </w:r>
-      <w:r>
-        <w:rPr>
-          <w:rStyle w:val="VerbatimChar"/>
-        </w:rPr>
-        <w:t xml:space="preserve">sex</w:t>
-      </w:r>
-      <w:r>
-        <w:t xml:space="preserve">,</w:t>
-      </w:r>
-      <w:r>
-        <w:t xml:space="preserve"> </w:t>
-      </w:r>
-      <w:r>
-        <w:rPr>
-          <w:rStyle w:val="VerbatimChar"/>
-        </w:rPr>
-        <w:t xml:space="preserve">native-country</w:t>
-      </w:r>
-      <w:r>
-        <w:t xml:space="preserve">,</w:t>
+        <w:t xml:space="preserve"> </w:t>
+      </w:r>
+      <w:r>
+        <w:t xml:space="preserve">— вероятно, кодировка отсутствующих данных. Целевой</w:t>
+      </w:r>
+      <w:r>
+        <w:t xml:space="preserve"> </w:t>
+      </w:r>
+      <w:r>
+        <w:t xml:space="preserve">признак</w:t>
       </w:r>
       <w:r>
         <w:t xml:space="preserve"> </w:t>
@@ -1124,105 +1173,10 @@
         <w:t xml:space="preserve">class</w:t>
       </w:r>
       <w:r>
-        <w:t xml:space="preserve">.</w:t>
-      </w:r>
-    </w:p>
-    <w:p>
-      <w:pPr>
-        <w:pStyle w:val="BodyText"/>
-      </w:pPr>
-      <w:r>
-        <w:t xml:space="preserve">Все столбцы содержат 48 842 непустых значения — явных пропусков нет.</w:t>
-      </w:r>
-      <w:r>
-        <w:t xml:space="preserve"> </w:t>
-      </w:r>
-      <w:r>
-        <w:t xml:space="preserve">Однако визуальный осмотр выявил значение</w:t>
-      </w:r>
-      <w:r>
-        <w:t xml:space="preserve"> </w:t>
-      </w:r>
-      <w:r>
-        <w:rPr>
-          <w:rStyle w:val="VerbatimChar"/>
-        </w:rPr>
-        <w:t xml:space="preserve">?</w:t>
-      </w:r>
-      <w:r>
-        <w:t xml:space="preserve"> </w:t>
-      </w:r>
-      <w:r>
-        <w:t xml:space="preserve">в столбцах</w:t>
-      </w:r>
-      <w:r>
-        <w:t xml:space="preserve"> </w:t>
-      </w:r>
-      <w:r>
-        <w:rPr>
-          <w:rStyle w:val="VerbatimChar"/>
-        </w:rPr>
-        <w:t xml:space="preserve">workclass</w:t>
-      </w:r>
-      <w:r>
-        <w:t xml:space="preserve">,</w:t>
-      </w:r>
-      <w:r>
-        <w:t xml:space="preserve"> </w:t>
-      </w:r>
-      <w:r>
-        <w:rPr>
-          <w:rStyle w:val="VerbatimChar"/>
-        </w:rPr>
-        <w:t xml:space="preserve">occupation</w:t>
-      </w:r>
-      <w:r>
-        <w:t xml:space="preserve"> </w:t>
-      </w:r>
-      <w:r>
-        <w:t xml:space="preserve">и</w:t>
-      </w:r>
-      <w:r>
-        <w:t xml:space="preserve"> </w:t>
-      </w:r>
-      <w:r>
-        <w:rPr>
-          <w:rStyle w:val="VerbatimChar"/>
-        </w:rPr>
-        <w:t xml:space="preserve">native-country</w:t>
-      </w:r>
-      <w:r>
-        <w:t xml:space="preserve"> </w:t>
-      </w:r>
-      <w:r>
-        <w:t xml:space="preserve">— вероятно, так закодированы</w:t>
-      </w:r>
-      <w:r>
-        <w:t xml:space="preserve"> </w:t>
-      </w:r>
-      <w:r>
-        <w:t xml:space="preserve">отсутствующие данные. Это потребует обработки в Lab 2.</w:t>
-      </w:r>
-      <w:r>
-        <w:t xml:space="preserve"> </w:t>
-      </w:r>
-      <w:r>
-        <w:t xml:space="preserve">Целевой признак</w:t>
-      </w:r>
-      <w:r>
-        <w:t xml:space="preserve"> </w:t>
-      </w:r>
-      <w:r>
-        <w:rPr>
-          <w:rStyle w:val="VerbatimChar"/>
-        </w:rPr>
-        <w:t xml:space="preserve">class</w:t>
-      </w:r>
-      <w:r>
-        <w:t xml:space="preserve"> </w:t>
-      </w:r>
-      <w:r>
-        <w:t xml:space="preserve">принимает два значения:</w:t>
+        <w:t xml:space="preserve"> </w:t>
+      </w:r>
+      <w:r>
+        <w:t xml:space="preserve">принимает значения</w:t>
       </w:r>
       <w:r>
         <w:t xml:space="preserve"> </w:t>
@@ -1320,7 +1274,7 @@
         <w:rPr>
           <w:rStyle w:val="VerbatimChar"/>
         </w:rPr>
-        <w:t xml:space="preserve">                age        fnlwgt  education-num   capitalgain  hoursperweek</w:t>
+        <w:t xml:space="preserve">                age        fnlwgt  education-num  capitalgain  hoursperweek</w:t>
       </w:r>
       <w:r>
         <w:br/>
@@ -1404,7 +1358,7 @@
         <w:rPr>
           <w:rStyle w:val="VerbatimChar"/>
         </w:rPr>
-        <w:t xml:space="preserve">       workclass education      marital-status  ...    sex  class</w:t>
+        <w:t xml:space="preserve">       workclass education      marital-status  ...   sex  class</w:t>
       </w:r>
       <w:r>
         <w:br/>
@@ -1478,13 +1432,13 @@
         <w:t xml:space="preserve"> </w:t>
       </w:r>
       <w:r>
-        <w:t xml:space="preserve">закодированы в диапазоны 0–4, а не</w:t>
-      </w:r>
-      <w:r>
-        <w:t xml:space="preserve"> </w:t>
-      </w:r>
-      <w:r>
-        <w:t xml:space="preserve">хранятся в исходном виде. Признаки</w:t>
+        <w:t xml:space="preserve">закодированы в диапазоны 0–4.</w:t>
+      </w:r>
+      <w:r>
+        <w:t xml:space="preserve"> </w:t>
+      </w:r>
+      <w:r>
+        <w:t xml:space="preserve">Признаки</w:t>
       </w:r>
       <w:r>
         <w:t xml:space="preserve"> </w:t>
@@ -1514,28 +1468,13 @@
         <w:t xml:space="preserve"> </w:t>
       </w:r>
       <w:r>
-        <w:t xml:space="preserve">сильно скошены вправо: медиана и 75-й перцентиль равны 0.</w:t>
-      </w:r>
-      <w:r>
-        <w:t xml:space="preserve"> </w:t>
-      </w:r>
-      <w:r>
-        <w:t xml:space="preserve">Целевой признак</w:t>
-      </w:r>
-      <w:r>
-        <w:t xml:space="preserve"> </w:t>
-      </w:r>
-      <w:r>
-        <w:rPr>
-          <w:rStyle w:val="VerbatimChar"/>
-        </w:rPr>
-        <w:t xml:space="preserve">class</w:t>
-      </w:r>
-      <w:r>
-        <w:t xml:space="preserve"> </w:t>
-      </w:r>
-      <w:r>
-        <w:t xml:space="preserve">несбалансирован:</w:t>
+        <w:t xml:space="preserve">сильно скошены вправо:</w:t>
+      </w:r>
+      <w:r>
+        <w:t xml:space="preserve"> </w:t>
+      </w:r>
+      <w:r>
+        <w:t xml:space="preserve">медиана и 75-й перцентиль равны 0. Целевой признак несбалансирован:</w:t>
       </w:r>
       <w:r>
         <w:t xml:space="preserve"> </w:t>
@@ -1550,7 +1489,7 @@
         <w:t xml:space="preserve"> </w:t>
       </w:r>
       <w:r>
-        <w:t xml:space="preserve">— 37 155 записей,</w:t>
+        <w:t xml:space="preserve">— 37 155 записей (≈76%),</w:t>
       </w:r>
       <w:r>
         <w:t xml:space="preserve"> </w:t>
@@ -1565,7 +1504,7 @@
         <w:t xml:space="preserve"> </w:t>
       </w:r>
       <w:r>
-        <w:t xml:space="preserve">— 11 687 (≈76% / 24%).</w:t>
+        <w:t xml:space="preserve">— 11 687 (≈24%).</w:t>
       </w:r>
     </w:p>
     <w:bookmarkEnd w:id="1"/>
@@ -1604,7 +1543,7 @@
         <w:rPr>
           <w:rStyle w:val="StringTok"/>
         </w:rPr>
-        <w:t xml:space="preserve">'class'</w:t>
+        <w:t xml:space="preserve">"class"</w:t>
       </w:r>
       <w:r>
         <w:rPr>
@@ -1628,7 +1567,7 @@
         <w:rPr>
           <w:rStyle w:val="StringTok"/>
         </w:rPr>
-        <w:t xml:space="preserve">'&gt;50K'</w:t>
+        <w:t xml:space="preserve">"&gt;50K"</w:t>
       </w:r>
       <w:r>
         <w:rPr>
@@ -1661,7 +1600,7 @@
         <w:rPr>
           <w:rStyle w:val="StringTok"/>
         </w:rPr>
-        <w:t xml:space="preserve">'class'</w:t>
+        <w:t xml:space="preserve">"class"</w:t>
       </w:r>
       <w:r>
         <w:rPr>
@@ -1685,7 +1624,7 @@
         <w:rPr>
           <w:rStyle w:val="StringTok"/>
         </w:rPr>
-        <w:t xml:space="preserve">'&gt;50K'</w:t>
+        <w:t xml:space="preserve">"&gt;50K"</w:t>
       </w:r>
       <w:r>
         <w:rPr>
@@ -1709,7 +1648,7 @@
         <w:rPr>
           <w:rStyle w:val="StringTok"/>
         </w:rPr>
-        <w:t xml:space="preserve">'sex'</w:t>
+        <w:t xml:space="preserve">"sex"</w:t>
       </w:r>
       <w:r>
         <w:rPr>
@@ -1733,7 +1672,7 @@
         <w:rPr>
           <w:rStyle w:val="StringTok"/>
         </w:rPr>
-        <w:t xml:space="preserve">'Male'</w:t>
+        <w:t xml:space="preserve">"Male"</w:t>
       </w:r>
       <w:r>
         <w:rPr>
@@ -1766,7 +1705,7 @@
         <w:rPr>
           <w:rStyle w:val="StringTok"/>
         </w:rPr>
-        <w:t xml:space="preserve">'age'</w:t>
+        <w:t xml:space="preserve">"age"</w:t>
       </w:r>
       <w:r>
         <w:rPr>
@@ -1802,7 +1741,7 @@
         <w:rPr>
           <w:rStyle w:val="StringTok"/>
         </w:rPr>
-        <w:t xml:space="preserve">'age'</w:t>
+        <w:t xml:space="preserve">"age"</w:t>
       </w:r>
       <w:r>
         <w:rPr>
@@ -1814,7 +1753,7 @@
         <w:rPr>
           <w:rStyle w:val="StringTok"/>
         </w:rPr>
-        <w:t xml:space="preserve">'education'</w:t>
+        <w:t xml:space="preserve">"education"</w:t>
       </w:r>
       <w:r>
         <w:rPr>
@@ -1826,7 +1765,7 @@
         <w:rPr>
           <w:rStyle w:val="StringTok"/>
         </w:rPr>
-        <w:t xml:space="preserve">'class'</w:t>
+        <w:t xml:space="preserve">"class"</w:t>
       </w:r>
       <w:r>
         <w:rPr>
@@ -1885,6 +1824,24 @@
         <w:br/>
       </w:r>
       <w:r>
+        <w:rPr>
+          <w:rStyle w:val="VerbatimChar"/>
+        </w:rPr>
+        <w:t xml:space="preserve">10    2           Private  280464  Some-college  ...   &gt;50K</w:t>
+      </w:r>
+      <w:r>
+        <w:br/>
+      </w:r>
+      <w:r>
+        <w:rPr>
+          <w:rStyle w:val="VerbatimChar"/>
+        </w:rPr>
+        <w:t xml:space="preserve">11    1         State-gov  141297     Bachelors  ...   &gt;50K</w:t>
+      </w:r>
+      <w:r>
+        <w:br/>
+      </w:r>
+      <w:r>
         <w:br/>
       </w:r>
       <w:r>
@@ -1924,6 +1881,15 @@
         <w:br/>
       </w:r>
       <w:r>
+        <w:rPr>
+          <w:rStyle w:val="VerbatimChar"/>
+        </w:rPr>
+        <w:t xml:space="preserve">10    2           Private  280464  Some-college  ...   &gt;50K</w:t>
+      </w:r>
+      <w:r>
+        <w:br/>
+      </w:r>
+      <w:r>
         <w:br/>
       </w:r>
       <w:r>
@@ -1989,19 +1955,19 @@
         <w:t xml:space="preserve"> </w:t>
       </w:r>
       <w:r>
-        <w:t xml:space="preserve">мужчин — 9 918 (≈84,9%).</w:t>
-      </w:r>
-      <w:r>
-        <w:t xml:space="preserve"> </w:t>
-      </w:r>
-      <w:r>
-        <w:t xml:space="preserve">При двойной фильтрации условия заключаются в скобки и соединяются</w:t>
-      </w:r>
-      <w:r>
-        <w:t xml:space="preserve"> </w:t>
-      </w:r>
-      <w:r>
-        <w:t xml:space="preserve">оператором</w:t>
+        <w:t xml:space="preserve">мужчин — 9 918 (≈84,9%) —</w:t>
+      </w:r>
+      <w:r>
+        <w:t xml:space="preserve"> </w:t>
+      </w:r>
+      <w:r>
+        <w:t xml:space="preserve">выраженный гендерный дисбаланс среди высокооплачиваемых. При двойной</w:t>
+      </w:r>
+      <w:r>
+        <w:t xml:space="preserve"> </w:t>
+      </w:r>
+      <w:r>
+        <w:t xml:space="preserve">фильтрации условия заключаются в скобки и соединяются оператором</w:t>
       </w:r>
       <w:r>
         <w:t xml:space="preserve"> </w:t>
@@ -2013,28 +1979,7 @@
         <w:t xml:space="preserve">&amp;</w:t>
       </w:r>
       <w:r>
-        <w:t xml:space="preserve">. Метод</w:t>
-      </w:r>
-      <w:r>
-        <w:t xml:space="preserve"> </w:t>
-      </w:r>
-      <w:r>
-        <w:rPr>
-          <w:rStyle w:val="VerbatimChar"/>
-        </w:rPr>
-        <w:t xml:space="preserve">df.loc[условие, столбцы]</w:t>
-      </w:r>
-      <w:r>
-        <w:t xml:space="preserve"> </w:t>
-      </w:r>
-      <w:r>
-        <w:t xml:space="preserve">позволяет одновременно</w:t>
-      </w:r>
-      <w:r>
-        <w:t xml:space="preserve"> </w:t>
-      </w:r>
-      <w:r>
-        <w:t xml:space="preserve">фильтровать строки и выбирать нужные столбцы.</w:t>
+        <w:t xml:space="preserve">.</w:t>
       </w:r>
     </w:p>
     <w:bookmarkEnd w:id="2"/>
@@ -2480,6 +2425,99 @@
         </w:rPr>
         <w:t xml:space="preserve">]</w:t>
       </w:r>
+      <w:r>
+        <w:br/>
+      </w:r>
+      <w:r>
+        <w:rPr>
+          <w:rStyle w:val="NormalTok"/>
+        </w:rPr>
+        <w:t xml:space="preserve">third_age_value </w:t>
+      </w:r>
+      <w:r>
+        <w:rPr>
+          <w:rStyle w:val="OperatorTok"/>
+        </w:rPr>
+        <w:t xml:space="preserve">=</w:t>
+      </w:r>
+      <w:r>
+        <w:rPr>
+          <w:rStyle w:val="NormalTok"/>
+        </w:rPr>
+        <w:t xml:space="preserve"> df.sort_values(by</w:t>
+      </w:r>
+      <w:r>
+        <w:rPr>
+          <w:rStyle w:val="OperatorTok"/>
+        </w:rPr>
+        <w:t xml:space="preserve">=</w:t>
+      </w:r>
+      <w:r>
+        <w:rPr>
+          <w:rStyle w:val="NormalTok"/>
+        </w:rPr>
+        <w:t xml:space="preserve">[</w:t>
+      </w:r>
+      <w:r>
+        <w:rPr>
+          <w:rStyle w:val="StringTok"/>
+        </w:rPr>
+        <w:t xml:space="preserve">"age"</w:t>
+      </w:r>
+      <w:r>
+        <w:rPr>
+          <w:rStyle w:val="NormalTok"/>
+        </w:rPr>
+        <w:t xml:space="preserve">], ascending</w:t>
+      </w:r>
+      <w:r>
+        <w:rPr>
+          <w:rStyle w:val="OperatorTok"/>
+        </w:rPr>
+        <w:t xml:space="preserve">=</w:t>
+      </w:r>
+      <w:r>
+        <w:rPr>
+          <w:rStyle w:val="NormalTok"/>
+        </w:rPr>
+        <w:t xml:space="preserve">[</w:t>
+      </w:r>
+      <w:r>
+        <w:rPr>
+          <w:rStyle w:val="VariableTok"/>
+        </w:rPr>
+        <w:t xml:space="preserve">False</w:t>
+      </w:r>
+      <w:r>
+        <w:rPr>
+          <w:rStyle w:val="NormalTok"/>
+        </w:rPr>
+        <w:t xml:space="preserve">]).iloc[</w:t>
+      </w:r>
+      <w:r>
+        <w:rPr>
+          <w:rStyle w:val="DecValTok"/>
+        </w:rPr>
+        <w:t xml:space="preserve">2</w:t>
+      </w:r>
+      <w:r>
+        <w:rPr>
+          <w:rStyle w:val="NormalTok"/>
+        </w:rPr>
+        <w:t xml:space="preserve">, </w:t>
+      </w:r>
+      <w:r>
+        <w:rPr>
+          <w:rStyle w:val="DecValTok"/>
+        </w:rPr>
+        <w:t xml:space="preserve">0</w:t>
+      </w:r>
+      <w:r>
+        <w:rPr>
+          <w:rStyle w:val="NormalTok"/>
+        </w:rPr>
+        <w:t xml:space="preserve">]</w:t>
+      </w:r>
     </w:p>
     <w:p>
       <w:pPr>
@@ -2585,6 +2623,54 @@
         <w:rPr>
           <w:rStyle w:val="VerbatimChar"/>
         </w:rPr>
+        <w:t xml:space="preserve">--- Сортировка по возрасту (убыв.) и education-num (возр.) ---</w:t>
+      </w:r>
+      <w:r>
+        <w:br/>
+      </w:r>
+      <w:r>
+        <w:rPr>
+          <w:rStyle w:val="VerbatimChar"/>
+        </w:rPr>
+        <w:t xml:space="preserve">       age  education  education-num</w:t>
+      </w:r>
+      <w:r>
+        <w:br/>
+      </w:r>
+      <w:r>
+        <w:rPr>
+          <w:rStyle w:val="VerbatimChar"/>
+        </w:rPr>
+        <w:t xml:space="preserve">2884     4  Preschool              1</w:t>
+      </w:r>
+      <w:r>
+        <w:br/>
+      </w:r>
+      <w:r>
+        <w:rPr>
+          <w:rStyle w:val="VerbatimChar"/>
+        </w:rPr>
+        <w:t xml:space="preserve">7173     4  Preschool              1</w:t>
+      </w:r>
+      <w:r>
+        <w:br/>
+      </w:r>
+      <w:r>
+        <w:rPr>
+          <w:rStyle w:val="VerbatimChar"/>
+        </w:rPr>
+        <w:t xml:space="preserve">10310    4  Preschool              1</w:t>
+      </w:r>
+      <w:r>
+        <w:br/>
+      </w:r>
+      <w:r>
+        <w:br/>
+      </w:r>
+      <w:r>
+        <w:rPr>
+          <w:rStyle w:val="VerbatimChar"/>
+        </w:rPr>
         <w:t xml:space="preserve">--- Человек с максимальным возрастом ---</w:t>
       </w:r>
       <w:r>
@@ -2743,22 +2829,31 @@
         <w:pStyle w:val="FirstParagraph"/>
       </w:pPr>
       <w:r>
-        <w:t xml:space="preserve">Метод</w:t>
-      </w:r>
-      <w:r>
-        <w:t xml:space="preserve"> </w:t>
-      </w:r>
-      <w:r>
-        <w:rPr>
-          <w:rStyle w:val="VerbatimChar"/>
-        </w:rPr>
-        <w:t xml:space="preserve">sort_values()</w:t>
-      </w:r>
-      <w:r>
-        <w:t xml:space="preserve"> </w:t>
-      </w:r>
-      <w:r>
-        <w:t xml:space="preserve">принимает</w:t>
+        <w:rPr>
+          <w:rStyle w:val="VerbatimChar"/>
+        </w:rPr>
+        <w:t xml:space="preserve">iloc[0]</w:t>
+      </w:r>
+      <w:r>
+        <w:t xml:space="preserve"> </w:t>
+      </w:r>
+      <w:r>
+        <w:t xml:space="preserve">— первая строка после сортировки (нумерация с нуля).</w:t>
+      </w:r>
+      <w:r>
+        <w:t xml:space="preserve"> </w:t>
+      </w:r>
+      <w:r>
+        <w:rPr>
+          <w:rStyle w:val="VerbatimChar"/>
+        </w:rPr>
+        <w:t xml:space="preserve">iloc[2, 0]</w:t>
+      </w:r>
+      <w:r>
+        <w:t xml:space="preserve"> </w:t>
+      </w:r>
+      <w:r>
+        <w:t xml:space="preserve">— значение из первого столбца третьей строки.</w:t>
       </w:r>
       <w:r>
         <w:t xml:space="preserve"> </w:t>
@@ -2788,55 +2883,13 @@
         <w:t xml:space="preserve"> </w:t>
       </w:r>
       <w:r>
-        <w:t xml:space="preserve">как списки —</w:t>
-      </w:r>
-      <w:r>
-        <w:t xml:space="preserve"> </w:t>
-      </w:r>
-      <w:r>
-        <w:t xml:space="preserve">это обеспечивает единообразный синтаксис для одно- и многоключевой</w:t>
-      </w:r>
-      <w:r>
-        <w:t xml:space="preserve"> </w:t>
-      </w:r>
-      <w:r>
-        <w:t xml:space="preserve">сортировки.</w:t>
-      </w:r>
-      <w:r>
-        <w:t xml:space="preserve"> </w:t>
-      </w:r>
-      <w:r>
-        <w:rPr>
-          <w:rStyle w:val="VerbatimChar"/>
-        </w:rPr>
-        <w:t xml:space="preserve">iloc[0]</w:t>
-      </w:r>
-      <w:r>
-        <w:t xml:space="preserve"> </w:t>
-      </w:r>
-      <w:r>
-        <w:t xml:space="preserve">— первая строка после сортировки (нумерация</w:t>
-      </w:r>
-      <w:r>
-        <w:t xml:space="preserve"> </w:t>
-      </w:r>
-      <w:r>
-        <w:t xml:space="preserve">с нуля),</w:t>
-      </w:r>
-      <w:r>
-        <w:t xml:space="preserve"> </w:t>
-      </w:r>
-      <w:r>
-        <w:rPr>
-          <w:rStyle w:val="VerbatimChar"/>
-        </w:rPr>
-        <w:t xml:space="preserve">iloc[2, 0]</w:t>
-      </w:r>
-      <w:r>
-        <w:t xml:space="preserve"> </w:t>
-      </w:r>
-      <w:r>
-        <w:t xml:space="preserve">— значение из первого столбца третьей строки.</w:t>
+        <w:t xml:space="preserve">передаются как списки — единообразный синтаксис</w:t>
+      </w:r>
+      <w:r>
+        <w:t xml:space="preserve"> </w:t>
+      </w:r>
+      <w:r>
+        <w:t xml:space="preserve">для одно- и многоключевой сортировки.</w:t>
       </w:r>
     </w:p>
     <w:bookmarkEnd w:id="3"/>
@@ -3023,7 +3076,7 @@
         <w:t xml:space="preserve"> </w:t>
       </w:r>
       <w:r>
-        <w:t xml:space="preserve">в знаменателе — защита от деления на ноль: у большинства людей</w:t>
+        <w:t xml:space="preserve">в знаменателе — защита от деления на ноль: у большинства строк</w:t>
       </w:r>
       <w:r>
         <w:t xml:space="preserve"> </w:t>
@@ -3035,31 +3088,7 @@
         <w:t xml:space="preserve">capitalloss = 0</w:t>
       </w:r>
       <w:r>
-        <w:t xml:space="preserve">, деление на ноль дало бы</w:t>
-      </w:r>
-      <w:r>
-        <w:t xml:space="preserve"> </w:t>
-      </w:r>
-      <w:r>
-        <w:rPr>
-          <w:rStyle w:val="VerbatimChar"/>
-        </w:rPr>
-        <w:t xml:space="preserve">inf</w:t>
-      </w:r>
-      <w:r>
-        <w:t xml:space="preserve">. Новый столбец</w:t>
-      </w:r>
-      <w:r>
-        <w:t xml:space="preserve"> </w:t>
-      </w:r>
-      <w:r>
-        <w:t xml:space="preserve">вычисляется векторизованно — Pandas применяет операцию ко всему</w:t>
-      </w:r>
-      <w:r>
-        <w:t xml:space="preserve"> </w:t>
-      </w:r>
-      <w:r>
-        <w:t xml:space="preserve">столбцу сразу, без явного цикла.</w:t>
+        <w:t xml:space="preserve">. Столбец вычисляется векторизованно без явного цикла.</w:t>
       </w:r>
     </w:p>
     <w:bookmarkEnd w:id="4"/>
@@ -3301,6 +3330,15 @@
         <w:rPr>
           <w:rStyle w:val="VerbatimChar"/>
         </w:rPr>
+        <w:t xml:space="preserve">capitalloss    0.060768 -0.004643       0.084891    -0.055408      0.056712      -0.055408</w:t>
+      </w:r>
+      <w:r>
+        <w:br/>
+      </w:r>
+      <w:r>
+        <w:rPr>
+          <w:rStyle w:val="VerbatimChar"/>
+        </w:rPr>
         <w:t xml:space="preserve">hoursperweek   0.115442 -0.008893       0.146786     0.099180      1.000000       0.099180</w:t>
       </w:r>
       <w:r>
@@ -3372,13 +3410,13 @@
         <w:t xml:space="preserve"> </w:t>
       </w:r>
       <w:r>
-        <w:t xml:space="preserve">идеально (1.000) —</w:t>
-      </w:r>
-      <w:r>
-        <w:t xml:space="preserve"> </w:t>
-      </w:r>
-      <w:r>
-        <w:t xml:space="preserve">у большинства строк</w:t>
+        <w:t xml:space="preserve">идеально (1.000): у</w:t>
+      </w:r>
+      <w:r>
+        <w:t xml:space="preserve"> </w:t>
+      </w:r>
+      <w:r>
+        <w:t xml:space="preserve">большинства строк</w:t>
       </w:r>
       <w:r>
         <w:t xml:space="preserve"> </w:t>
@@ -3390,85 +3428,13 @@
         <w:t xml:space="preserve">capitalloss = 0</w:t>
       </w:r>
       <w:r>
-        <w:t xml:space="preserve">, поэтому знаменатель формулы</w:t>
-      </w:r>
-      <w:r>
-        <w:t xml:space="preserve"> </w:t>
-      </w:r>
-      <w:r>
-        <w:t xml:space="preserve">константен и новый признак является точным линейным преобразованием</w:t>
-      </w:r>
-      <w:r>
-        <w:t xml:space="preserve"> </w:t>
-      </w:r>
-      <w:r>
-        <w:rPr>
-          <w:rStyle w:val="VerbatimChar"/>
-        </w:rPr>
-        <w:t xml:space="preserve">capitalgain</w:t>
-      </w:r>
-      <w:r>
-        <w:t xml:space="preserve">. Связь</w:t>
-      </w:r>
-      <w:r>
-        <w:t xml:space="preserve"> </w:t>
-      </w:r>
-      <w:r>
-        <w:rPr>
-          <w:rStyle w:val="VerbatimChar"/>
-        </w:rPr>
-        <w:t xml:space="preserve">hoursperweek</w:t>
-      </w:r>
-      <w:r>
-        <w:t xml:space="preserve"> </w:t>
-      </w:r>
-      <w:r>
-        <w:t xml:space="preserve">и</w:t>
-      </w:r>
-      <w:r>
-        <w:t xml:space="preserve"> </w:t>
-      </w:r>
-      <w:r>
-        <w:rPr>
-          <w:rStyle w:val="VerbatimChar"/>
-        </w:rPr>
-        <w:t xml:space="preserve">capitalgain</w:t>
-      </w:r>
-      <w:r>
-        <w:t xml:space="preserve"> </w:t>
-      </w:r>
-      <w:r>
-        <w:t xml:space="preserve">(0.099) и</w:t>
-      </w:r>
-      <w:r>
-        <w:t xml:space="preserve"> </w:t>
-      </w:r>
-      <w:r>
-        <w:rPr>
-          <w:rStyle w:val="VerbatimChar"/>
-        </w:rPr>
-        <w:t xml:space="preserve">education-num</w:t>
-      </w:r>
-      <w:r>
-        <w:t xml:space="preserve"> </w:t>
-      </w:r>
-      <w:r>
-        <w:t xml:space="preserve">и</w:t>
-      </w:r>
-      <w:r>
-        <w:t xml:space="preserve"> </w:t>
-      </w:r>
-      <w:r>
-        <w:rPr>
-          <w:rStyle w:val="VerbatimChar"/>
-        </w:rPr>
-        <w:t xml:space="preserve">hoursperweek</w:t>
-      </w:r>
-      <w:r>
-        <w:t xml:space="preserve"> </w:t>
-      </w:r>
-      <w:r>
-        <w:t xml:space="preserve">(0.147) слабая.</w:t>
+        <w:t xml:space="preserve">, знаменатель константен. Все</w:t>
+      </w:r>
+      <w:r>
+        <w:t xml:space="preserve"> </w:t>
+      </w:r>
+      <w:r>
+        <w:t xml:space="preserve">остальные пары имеют слабую связь (max r = 0.160).</w:t>
       </w:r>
     </w:p>
     <w:bookmarkEnd w:id="5"/>
@@ -3635,7 +3601,7 @@
         <w:rPr>
           <w:rStyle w:val="VerbatimChar"/>
         </w:rPr>
-        <w:t xml:space="preserve">--- Среднее по расе ---</w:t>
+        <w:t xml:space="preserve">--- Среднее education-num и hoursperweek по расе ---</w:t>
       </w:r>
       <w:r>
         <w:br/>
@@ -3710,7 +3676,7 @@
         <w:rPr>
           <w:rStyle w:val="VerbatimChar"/>
         </w:rPr>
-        <w:t xml:space="preserve">--- Среднее по полу и расе ---</w:t>
+        <w:t xml:space="preserve">--- Среднее education-num и hoursperweek по полу и расе ---</w:t>
       </w:r>
       <w:r>
         <w:br/>
@@ -3764,6 +3730,24 @@
         <w:rPr>
           <w:rStyle w:val="VerbatimChar"/>
         </w:rPr>
+        <w:t xml:space="preserve">       Other                    9.038710      1.554839</w:t>
+      </w:r>
+      <w:r>
+        <w:br/>
+      </w:r>
+      <w:r>
+        <w:rPr>
+          <w:rStyle w:val="VerbatimChar"/>
+        </w:rPr>
+        <w:t xml:space="preserve">       White                   10.123206      1.633991</w:t>
+      </w:r>
+      <w:r>
+        <w:br/>
+      </w:r>
+      <w:r>
+        <w:rPr>
+          <w:rStyle w:val="VerbatimChar"/>
+        </w:rPr>
         <w:t xml:space="preserve">Male   Amer-Indian-Eskimo       9.192982      2.098246</w:t>
       </w:r>
       <w:r>
@@ -3782,6 +3766,24 @@
         <w:rPr>
           <w:rStyle w:val="VerbatimChar"/>
         </w:rPr>
+        <w:t xml:space="preserve">       Black                    9.393353      1.941523</w:t>
+      </w:r>
+      <w:r>
+        <w:br/>
+      </w:r>
+      <w:r>
+        <w:rPr>
+          <w:rStyle w:val="VerbatimChar"/>
+        </w:rPr>
+        <w:t xml:space="preserve">       Other                    8.717131      2.007968</w:t>
+      </w:r>
+      <w:r>
+        <w:br/>
+      </w:r>
+      <w:r>
+        <w:rPr>
+          <w:rStyle w:val="VerbatimChar"/>
+        </w:rPr>
         <w:t xml:space="preserve">       White                   10.133461      2.119158</w:t>
       </w:r>
     </w:p>
@@ -3790,40 +3792,13 @@
         <w:pStyle w:val="FirstParagraph"/>
       </w:pPr>
       <w:r>
-        <w:rPr>
-          <w:rStyle w:val="VerbatimChar"/>
-        </w:rPr>
-        <w:t xml:space="preserve">groupby()</w:t>
-      </w:r>
-      <w:r>
-        <w:t xml:space="preserve"> </w:t>
-      </w:r>
-      <w:r>
-        <w:t xml:space="preserve">разбивает датафрейм на группы по уникальным значениям</w:t>
-      </w:r>
-      <w:r>
-        <w:t xml:space="preserve"> </w:t>
-      </w:r>
-      <w:r>
-        <w:t xml:space="preserve">признака. При двойной группировке результат имеет двухуровневый</w:t>
-      </w:r>
-      <w:r>
-        <w:t xml:space="preserve"> </w:t>
-      </w:r>
-      <w:r>
-        <w:t xml:space="preserve">индекс (MultiIndex). Мужчины всех расовых групп работают больше часов,</w:t>
-      </w:r>
-      <w:r>
-        <w:t xml:space="preserve"> </w:t>
-      </w:r>
-      <w:r>
-        <w:t xml:space="preserve">чем женщины. Мужчины азиатского происхождения имеют наибольшее</w:t>
-      </w:r>
-      <w:r>
-        <w:t xml:space="preserve"> </w:t>
-      </w:r>
-      <w:r>
-        <w:t xml:space="preserve">среднее</w:t>
+        <w:t xml:space="preserve">Мужчины всех расовых групп работают больше часов, чем женщины.</w:t>
+      </w:r>
+      <w:r>
+        <w:t xml:space="preserve"> </w:t>
+      </w:r>
+      <w:r>
+        <w:t xml:space="preserve">Мужчины азиатского происхождения имеют наибольшее среднее</w:t>
       </w:r>
       <w:r>
         <w:t xml:space="preserve"> </w:t>
@@ -3838,7 +3813,13 @@
         <w:t xml:space="preserve"> </w:t>
       </w:r>
       <w:r>
-        <w:t xml:space="preserve">(11.26) среди всех групп.</w:t>
+        <w:t xml:space="preserve">(11.26). При двойной группировке результат имеет</w:t>
+      </w:r>
+      <w:r>
+        <w:t xml:space="preserve"> </w:t>
+      </w:r>
+      <w:r>
+        <w:t xml:space="preserve">двухуровневый индекс (MultiIndex).</w:t>
       </w:r>
     </w:p>
     <w:p>
@@ -3897,40 +3878,25 @@
         <w:t xml:space="preserve"> </w:t>
       </w:r>
       <w:r>
-        <w:t xml:space="preserve">неравенство (≈85% мужчин). Добавление расчётного признака</w:t>
-      </w:r>
-      <w:r>
-        <w:t xml:space="preserve"> </w:t>
-      </w:r>
-      <w:r>
-        <w:rPr>
-          <w:rStyle w:val="VerbatimChar"/>
-        </w:rPr>
-        <w:t xml:space="preserve">capital_ratio</w:t>
-      </w:r>
-      <w:r>
-        <w:t xml:space="preserve"> </w:t>
-      </w:r>
-      <w:r>
-        <w:t xml:space="preserve">и корреляционный анализ подтвердили слабую линейную</w:t>
-      </w:r>
-      <w:r>
-        <w:t xml:space="preserve"> </w:t>
-      </w:r>
-      <w:r>
-        <w:t xml:space="preserve">связь между числовыми признаками (max r = 0.160). Группировка</w:t>
-      </w:r>
-      <w:r>
-        <w:t xml:space="preserve"> </w:t>
-      </w:r>
-      <w:r>
-        <w:t xml:space="preserve">по расовым и гендерным признакам показала устойчивое различие в</w:t>
-      </w:r>
-      <w:r>
-        <w:t xml:space="preserve"> </w:t>
-      </w:r>
-      <w:r>
-        <w:t xml:space="preserve">рабочих часах между мужчинами и женщинами во всех расовых группах.</w:t>
+        <w:t xml:space="preserve">неравенство (≈85% мужчин). Корреляционный анализ показал слабую</w:t>
+      </w:r>
+      <w:r>
+        <w:t xml:space="preserve"> </w:t>
+      </w:r>
+      <w:r>
+        <w:t xml:space="preserve">линейную связь между числовыми признаками. Группировка по расовым</w:t>
+      </w:r>
+      <w:r>
+        <w:t xml:space="preserve"> </w:t>
+      </w:r>
+      <w:r>
+        <w:t xml:space="preserve">и гендерным признакам выявила устойчивое различие в рабочих часах</w:t>
+      </w:r>
+      <w:r>
+        <w:t xml:space="preserve"> </w:t>
+      </w:r>
+      <w:r>
+        <w:t xml:space="preserve">между мужчинами и женщинами во всех расовых группах.</w:t>
       </w:r>
     </w:p>
     <w:bookmarkEnd w:id="6"/>
@@ -4109,7 +4075,7 @@
     </w:lvl>
   </w:abstractNum>
   <w:abstractNum w:abstractNumId="2">
-    <w:nsid w:val="033B6CCF"/>
+    <w:nsid w:val="03525635"/>
     <w:multiLevelType w:val="multilevel"/>
     <w:lvl w:ilvl="0">
       <w:start w:val="1"/>

</xml_diff>